<commit_message>
fix(word): embed in-words line into table grid and adjust signature block spacing
</commit_message>
<xml_diff>
--- a/MAA_MOTORS_মাসিক_খরচ_ও_বেতন_বিবরণী.docx
+++ b/MAA_MOTORS_মাসিক_খরচ_ও_বেতন_বিবরণী.docx
@@ -33,7 +33,7 @@
           </w:tcPr>
           <w:p>
             <w:pPr>
-              <w:spacing w:before="0" w:after="0" w:line="240" w:lineRule="auto"/>
+              <w:spacing w:before="0" w:after="0" w:line="252" w:lineRule="auto"/>
               <w:jc w:val="center"/>
             </w:pPr>
             <w:r/>
@@ -72,7 +72,7 @@
           </w:tcPr>
           <w:p>
             <w:pPr>
-              <w:spacing w:before="0" w:after="0" w:line="240" w:lineRule="auto"/>
+              <w:spacing w:before="0" w:after="0" w:line="252" w:lineRule="auto"/>
               <w:jc w:val="center"/>
             </w:pPr>
             <w:r/>
@@ -85,7 +85,7 @@
                 <w:sz w:val="20"/>
                 <w:rFonts w:ascii="Hind Siliguri" w:hAnsi="Hind Siliguri" w:cs="Hind Siliguri"/>
               </w:rPr>
-              <w:t>মাসিক ব্যয় ও স্টাফ বেতন বিবরণী (বাণিজ্যিক ও অপারেশনাল লেয়ার — ১ম পাতা)</w:t>
+              <w:t>মাসিক সামগ্রিক ব্যয় ও বেতন বিবরণী (বাণিজ্যিক ও অপারেশনাল লেয়ার — ১ম পাতা)</w:t>
             </w:r>
           </w:p>
         </w:tc>
@@ -152,7 +152,7 @@
           </w:tcPr>
           <w:p>
             <w:pPr>
-              <w:spacing w:before="0" w:after="0" w:line="240" w:lineRule="auto"/>
+              <w:spacing w:before="0" w:after="0" w:line="252" w:lineRule="auto"/>
               <w:jc w:val="center"/>
             </w:pPr>
             <w:r/>
@@ -189,7 +189,7 @@
           </w:tcPr>
           <w:p>
             <w:pPr>
-              <w:spacing w:before="0" w:after="0" w:line="240" w:lineRule="auto"/>
+              <w:spacing w:before="0" w:after="0" w:line="252" w:lineRule="auto"/>
               <w:jc w:val="left"/>
             </w:pPr>
             <w:r/>
@@ -226,7 +226,7 @@
           </w:tcPr>
           <w:p>
             <w:pPr>
-              <w:spacing w:before="0" w:after="0" w:line="240" w:lineRule="auto"/>
+              <w:spacing w:before="0" w:after="0" w:line="252" w:lineRule="auto"/>
               <w:jc w:val="left"/>
             </w:pPr>
             <w:r/>
@@ -263,7 +263,7 @@
           </w:tcPr>
           <w:p>
             <w:pPr>
-              <w:spacing w:before="0" w:after="0" w:line="240" w:lineRule="auto"/>
+              <w:spacing w:before="0" w:after="0" w:line="252" w:lineRule="auto"/>
               <w:jc w:val="right"/>
             </w:pPr>
             <w:r/>
@@ -303,7 +303,7 @@
           </w:tcPr>
           <w:p>
             <w:pPr>
-              <w:spacing w:before="0" w:after="0" w:line="240" w:lineRule="auto"/>
+              <w:spacing w:before="0" w:after="0" w:line="252" w:lineRule="auto"/>
               <w:jc w:val="left"/>
             </w:pPr>
             <w:r/>
@@ -341,7 +341,7 @@
           </w:tcPr>
           <w:p>
             <w:pPr>
-              <w:spacing w:before="0" w:after="0" w:line="240" w:lineRule="auto"/>
+              <w:spacing w:before="0" w:after="0" w:line="252" w:lineRule="auto"/>
               <w:jc w:val="center"/>
             </w:pPr>
             <w:r/>
@@ -377,7 +377,7 @@
           </w:tcPr>
           <w:p>
             <w:pPr>
-              <w:spacing w:before="0" w:after="0" w:line="240" w:lineRule="auto"/>
+              <w:spacing w:before="0" w:after="0" w:line="252" w:lineRule="auto"/>
               <w:jc w:val="left"/>
             </w:pPr>
             <w:r/>
@@ -413,7 +413,7 @@
           </w:tcPr>
           <w:p>
             <w:pPr>
-              <w:spacing w:before="0" w:after="0" w:line="240" w:lineRule="auto"/>
+              <w:spacing w:before="0" w:after="0" w:line="252" w:lineRule="auto"/>
               <w:jc w:val="left"/>
             </w:pPr>
             <w:r/>
@@ -449,7 +449,7 @@
           </w:tcPr>
           <w:p>
             <w:pPr>
-              <w:spacing w:before="0" w:after="0" w:line="240" w:lineRule="auto"/>
+              <w:spacing w:before="0" w:after="0" w:line="252" w:lineRule="auto"/>
               <w:jc w:val="right"/>
             </w:pPr>
             <w:r/>
@@ -487,7 +487,7 @@
           </w:tcPr>
           <w:p>
             <w:pPr>
-              <w:spacing w:before="0" w:after="0" w:line="240" w:lineRule="auto"/>
+              <w:spacing w:before="0" w:after="0" w:line="252" w:lineRule="auto"/>
               <w:jc w:val="center"/>
             </w:pPr>
             <w:r/>
@@ -523,7 +523,7 @@
           </w:tcPr>
           <w:p>
             <w:pPr>
-              <w:spacing w:before="0" w:after="0" w:line="240" w:lineRule="auto"/>
+              <w:spacing w:before="0" w:after="0" w:line="252" w:lineRule="auto"/>
               <w:jc w:val="left"/>
             </w:pPr>
             <w:r/>
@@ -559,7 +559,7 @@
           </w:tcPr>
           <w:p>
             <w:pPr>
-              <w:spacing w:before="0" w:after="0" w:line="240" w:lineRule="auto"/>
+              <w:spacing w:before="0" w:after="0" w:line="252" w:lineRule="auto"/>
               <w:jc w:val="left"/>
             </w:pPr>
             <w:r/>
@@ -595,7 +595,7 @@
           </w:tcPr>
           <w:p>
             <w:pPr>
-              <w:spacing w:before="0" w:after="0" w:line="240" w:lineRule="auto"/>
+              <w:spacing w:before="0" w:after="0" w:line="252" w:lineRule="auto"/>
               <w:jc w:val="right"/>
             </w:pPr>
             <w:r/>
@@ -633,7 +633,7 @@
           </w:tcPr>
           <w:p>
             <w:pPr>
-              <w:spacing w:before="0" w:after="0" w:line="240" w:lineRule="auto"/>
+              <w:spacing w:before="0" w:after="0" w:line="252" w:lineRule="auto"/>
               <w:jc w:val="center"/>
             </w:pPr>
             <w:r/>
@@ -669,7 +669,7 @@
           </w:tcPr>
           <w:p>
             <w:pPr>
-              <w:spacing w:before="0" w:after="0" w:line="240" w:lineRule="auto"/>
+              <w:spacing w:before="0" w:after="0" w:line="252" w:lineRule="auto"/>
               <w:jc w:val="left"/>
             </w:pPr>
             <w:r/>
@@ -705,7 +705,7 @@
           </w:tcPr>
           <w:p>
             <w:pPr>
-              <w:spacing w:before="0" w:after="0" w:line="240" w:lineRule="auto"/>
+              <w:spacing w:before="0" w:after="0" w:line="252" w:lineRule="auto"/>
               <w:jc w:val="left"/>
             </w:pPr>
             <w:r/>
@@ -741,7 +741,7 @@
           </w:tcPr>
           <w:p>
             <w:pPr>
-              <w:spacing w:before="0" w:after="0" w:line="240" w:lineRule="auto"/>
+              <w:spacing w:before="0" w:after="0" w:line="252" w:lineRule="auto"/>
               <w:jc w:val="right"/>
             </w:pPr>
             <w:r/>
@@ -779,7 +779,7 @@
           </w:tcPr>
           <w:p>
             <w:pPr>
-              <w:spacing w:before="0" w:after="0" w:line="240" w:lineRule="auto"/>
+              <w:spacing w:before="0" w:after="0" w:line="252" w:lineRule="auto"/>
               <w:jc w:val="center"/>
             </w:pPr>
             <w:r/>
@@ -815,7 +815,7 @@
           </w:tcPr>
           <w:p>
             <w:pPr>
-              <w:spacing w:before="0" w:after="0" w:line="240" w:lineRule="auto"/>
+              <w:spacing w:before="0" w:after="0" w:line="252" w:lineRule="auto"/>
               <w:jc w:val="left"/>
             </w:pPr>
             <w:r/>
@@ -851,7 +851,7 @@
           </w:tcPr>
           <w:p>
             <w:pPr>
-              <w:spacing w:before="0" w:after="0" w:line="240" w:lineRule="auto"/>
+              <w:spacing w:before="0" w:after="0" w:line="252" w:lineRule="auto"/>
               <w:jc w:val="left"/>
             </w:pPr>
             <w:r/>
@@ -887,7 +887,7 @@
           </w:tcPr>
           <w:p>
             <w:pPr>
-              <w:spacing w:before="0" w:after="0" w:line="240" w:lineRule="auto"/>
+              <w:spacing w:before="0" w:after="0" w:line="252" w:lineRule="auto"/>
               <w:jc w:val="right"/>
             </w:pPr>
             <w:r/>
@@ -926,7 +926,7 @@
           </w:tcPr>
           <w:p>
             <w:pPr>
-              <w:spacing w:before="0" w:after="0" w:line="240" w:lineRule="auto"/>
+              <w:spacing w:before="0" w:after="0" w:line="252" w:lineRule="auto"/>
               <w:jc w:val="center"/>
             </w:pPr>
             <w:r/>
@@ -963,7 +963,7 @@
           </w:tcPr>
           <w:p>
             <w:pPr>
-              <w:spacing w:before="0" w:after="0" w:line="240" w:lineRule="auto"/>
+              <w:spacing w:before="0" w:after="0" w:line="252" w:lineRule="auto"/>
               <w:jc w:val="left"/>
             </w:pPr>
             <w:r/>
@@ -989,7 +989,7 @@
           </w:tcPr>
           <w:p>
             <w:pPr>
-              <w:spacing w:before="0" w:after="0" w:line="240" w:lineRule="auto"/>
+              <w:spacing w:before="0" w:after="0" w:line="252" w:lineRule="auto"/>
               <w:jc w:val="left"/>
             </w:pPr>
             <w:r/>
@@ -1026,7 +1026,7 @@
           </w:tcPr>
           <w:p>
             <w:pPr>
-              <w:spacing w:before="0" w:after="0" w:line="240" w:lineRule="auto"/>
+              <w:spacing w:before="0" w:after="0" w:line="252" w:lineRule="auto"/>
               <w:jc w:val="right"/>
             </w:pPr>
             <w:r/>
@@ -1055,7 +1055,7 @@
           </w:tcPr>
           <w:p>
             <w:pPr>
-              <w:spacing w:before="0" w:after="0" w:line="240" w:lineRule="auto"/>
+              <w:spacing w:before="0" w:after="0" w:line="252" w:lineRule="auto"/>
               <w:jc w:val="right"/>
             </w:pPr>
             <w:r/>
@@ -1092,7 +1092,7 @@
           </w:tcPr>
           <w:p>
             <w:pPr>
-              <w:spacing w:before="0" w:after="0" w:line="240" w:lineRule="auto"/>
+              <w:spacing w:before="0" w:after="0" w:line="252" w:lineRule="auto"/>
               <w:jc w:val="right"/>
             </w:pPr>
             <w:r/>
@@ -1132,7 +1132,7 @@
           </w:tcPr>
           <w:p>
             <w:pPr>
-              <w:spacing w:before="0" w:after="0" w:line="240" w:lineRule="auto"/>
+              <w:spacing w:before="0" w:after="0" w:line="252" w:lineRule="auto"/>
               <w:jc w:val="left"/>
             </w:pPr>
             <w:r/>
@@ -1170,7 +1170,7 @@
           </w:tcPr>
           <w:p>
             <w:pPr>
-              <w:spacing w:before="0" w:after="0" w:line="240" w:lineRule="auto"/>
+              <w:spacing w:before="0" w:after="0" w:line="252" w:lineRule="auto"/>
               <w:jc w:val="center"/>
             </w:pPr>
             <w:r/>
@@ -1206,7 +1206,7 @@
           </w:tcPr>
           <w:p>
             <w:pPr>
-              <w:spacing w:before="0" w:after="0" w:line="240" w:lineRule="auto"/>
+              <w:spacing w:before="0" w:after="0" w:line="252" w:lineRule="auto"/>
               <w:jc w:val="left"/>
             </w:pPr>
             <w:r/>
@@ -1242,7 +1242,7 @@
           </w:tcPr>
           <w:p>
             <w:pPr>
-              <w:spacing w:before="0" w:after="0" w:line="240" w:lineRule="auto"/>
+              <w:spacing w:before="0" w:after="0" w:line="252" w:lineRule="auto"/>
               <w:jc w:val="left"/>
             </w:pPr>
             <w:r/>
@@ -1278,7 +1278,7 @@
           </w:tcPr>
           <w:p>
             <w:pPr>
-              <w:spacing w:before="0" w:after="0" w:line="240" w:lineRule="auto"/>
+              <w:spacing w:before="0" w:after="0" w:line="252" w:lineRule="auto"/>
               <w:jc w:val="right"/>
             </w:pPr>
             <w:r/>
@@ -1316,7 +1316,7 @@
           </w:tcPr>
           <w:p>
             <w:pPr>
-              <w:spacing w:before="0" w:after="0" w:line="240" w:lineRule="auto"/>
+              <w:spacing w:before="0" w:after="0" w:line="252" w:lineRule="auto"/>
               <w:jc w:val="center"/>
             </w:pPr>
             <w:r/>
@@ -1352,7 +1352,7 @@
           </w:tcPr>
           <w:p>
             <w:pPr>
-              <w:spacing w:before="0" w:after="0" w:line="240" w:lineRule="auto"/>
+              <w:spacing w:before="0" w:after="0" w:line="252" w:lineRule="auto"/>
               <w:jc w:val="left"/>
             </w:pPr>
             <w:r/>
@@ -1388,7 +1388,7 @@
           </w:tcPr>
           <w:p>
             <w:pPr>
-              <w:spacing w:before="0" w:after="0" w:line="240" w:lineRule="auto"/>
+              <w:spacing w:before="0" w:after="0" w:line="252" w:lineRule="auto"/>
               <w:jc w:val="left"/>
             </w:pPr>
             <w:r/>
@@ -1424,7 +1424,7 @@
           </w:tcPr>
           <w:p>
             <w:pPr>
-              <w:spacing w:before="0" w:after="0" w:line="240" w:lineRule="auto"/>
+              <w:spacing w:before="0" w:after="0" w:line="252" w:lineRule="auto"/>
               <w:jc w:val="right"/>
             </w:pPr>
             <w:r/>
@@ -1462,7 +1462,7 @@
           </w:tcPr>
           <w:p>
             <w:pPr>
-              <w:spacing w:before="0" w:after="0" w:line="240" w:lineRule="auto"/>
+              <w:spacing w:before="0" w:after="0" w:line="252" w:lineRule="auto"/>
               <w:jc w:val="center"/>
             </w:pPr>
             <w:r/>
@@ -1498,7 +1498,7 @@
           </w:tcPr>
           <w:p>
             <w:pPr>
-              <w:spacing w:before="0" w:after="0" w:line="240" w:lineRule="auto"/>
+              <w:spacing w:before="0" w:after="0" w:line="252" w:lineRule="auto"/>
               <w:jc w:val="left"/>
             </w:pPr>
             <w:r/>
@@ -1534,7 +1534,7 @@
           </w:tcPr>
           <w:p>
             <w:pPr>
-              <w:spacing w:before="0" w:after="0" w:line="240" w:lineRule="auto"/>
+              <w:spacing w:before="0" w:after="0" w:line="252" w:lineRule="auto"/>
               <w:jc w:val="left"/>
             </w:pPr>
             <w:r/>
@@ -1570,7 +1570,7 @@
           </w:tcPr>
           <w:p>
             <w:pPr>
-              <w:spacing w:before="0" w:after="0" w:line="240" w:lineRule="auto"/>
+              <w:spacing w:before="0" w:after="0" w:line="252" w:lineRule="auto"/>
               <w:jc w:val="right"/>
             </w:pPr>
             <w:r/>
@@ -1608,7 +1608,7 @@
           </w:tcPr>
           <w:p>
             <w:pPr>
-              <w:spacing w:before="0" w:after="0" w:line="240" w:lineRule="auto"/>
+              <w:spacing w:before="0" w:after="0" w:line="252" w:lineRule="auto"/>
               <w:jc w:val="center"/>
             </w:pPr>
             <w:r/>
@@ -1644,7 +1644,7 @@
           </w:tcPr>
           <w:p>
             <w:pPr>
-              <w:spacing w:before="0" w:after="0" w:line="240" w:lineRule="auto"/>
+              <w:spacing w:before="0" w:after="0" w:line="252" w:lineRule="auto"/>
               <w:jc w:val="left"/>
             </w:pPr>
             <w:r/>
@@ -1680,7 +1680,7 @@
           </w:tcPr>
           <w:p>
             <w:pPr>
-              <w:spacing w:before="0" w:after="0" w:line="240" w:lineRule="auto"/>
+              <w:spacing w:before="0" w:after="0" w:line="252" w:lineRule="auto"/>
               <w:jc w:val="left"/>
             </w:pPr>
             <w:r/>
@@ -1716,7 +1716,7 @@
           </w:tcPr>
           <w:p>
             <w:pPr>
-              <w:spacing w:before="0" w:after="0" w:line="240" w:lineRule="auto"/>
+              <w:spacing w:before="0" w:after="0" w:line="252" w:lineRule="auto"/>
               <w:jc w:val="right"/>
             </w:pPr>
             <w:r/>
@@ -1755,7 +1755,7 @@
           </w:tcPr>
           <w:p>
             <w:pPr>
-              <w:spacing w:before="0" w:after="0" w:line="240" w:lineRule="auto"/>
+              <w:spacing w:before="0" w:after="0" w:line="252" w:lineRule="auto"/>
               <w:jc w:val="center"/>
             </w:pPr>
             <w:r/>
@@ -1792,7 +1792,7 @@
           </w:tcPr>
           <w:p>
             <w:pPr>
-              <w:spacing w:before="0" w:after="0" w:line="240" w:lineRule="auto"/>
+              <w:spacing w:before="0" w:after="0" w:line="252" w:lineRule="auto"/>
               <w:jc w:val="left"/>
             </w:pPr>
             <w:r/>
@@ -1818,7 +1818,7 @@
           </w:tcPr>
           <w:p>
             <w:pPr>
-              <w:spacing w:before="0" w:after="0" w:line="240" w:lineRule="auto"/>
+              <w:spacing w:before="0" w:after="0" w:line="252" w:lineRule="auto"/>
               <w:jc w:val="left"/>
             </w:pPr>
             <w:r/>
@@ -1855,7 +1855,7 @@
           </w:tcPr>
           <w:p>
             <w:pPr>
-              <w:spacing w:before="0" w:after="0" w:line="240" w:lineRule="auto"/>
+              <w:spacing w:before="0" w:after="0" w:line="252" w:lineRule="auto"/>
               <w:jc w:val="right"/>
             </w:pPr>
             <w:r/>
@@ -1884,7 +1884,7 @@
           </w:tcPr>
           <w:p>
             <w:pPr>
-              <w:spacing w:before="0" w:after="0" w:line="240" w:lineRule="auto"/>
+              <w:spacing w:before="0" w:after="0" w:line="252" w:lineRule="auto"/>
               <w:jc w:val="right"/>
             </w:pPr>
             <w:r/>
@@ -1921,7 +1921,7 @@
           </w:tcPr>
           <w:p>
             <w:pPr>
-              <w:spacing w:before="0" w:after="0" w:line="240" w:lineRule="auto"/>
+              <w:spacing w:before="0" w:after="0" w:line="252" w:lineRule="auto"/>
               <w:jc w:val="right"/>
             </w:pPr>
             <w:r/>
@@ -1961,7 +1961,7 @@
           </w:tcPr>
           <w:p>
             <w:pPr>
-              <w:spacing w:before="0" w:after="0" w:line="240" w:lineRule="auto"/>
+              <w:spacing w:before="0" w:after="0" w:line="252" w:lineRule="auto"/>
               <w:jc w:val="left"/>
             </w:pPr>
             <w:r/>
@@ -1999,7 +1999,7 @@
           </w:tcPr>
           <w:p>
             <w:pPr>
-              <w:spacing w:before="0" w:after="0" w:line="240" w:lineRule="auto"/>
+              <w:spacing w:before="0" w:after="0" w:line="252" w:lineRule="auto"/>
               <w:jc w:val="center"/>
             </w:pPr>
             <w:r/>
@@ -2035,7 +2035,7 @@
           </w:tcPr>
           <w:p>
             <w:pPr>
-              <w:spacing w:before="0" w:after="0" w:line="240" w:lineRule="auto"/>
+              <w:spacing w:before="0" w:after="0" w:line="252" w:lineRule="auto"/>
               <w:jc w:val="left"/>
             </w:pPr>
             <w:r/>
@@ -2071,7 +2071,7 @@
           </w:tcPr>
           <w:p>
             <w:pPr>
-              <w:spacing w:before="0" w:after="0" w:line="240" w:lineRule="auto"/>
+              <w:spacing w:before="0" w:after="0" w:line="252" w:lineRule="auto"/>
               <w:jc w:val="left"/>
             </w:pPr>
             <w:r/>
@@ -2107,7 +2107,7 @@
           </w:tcPr>
           <w:p>
             <w:pPr>
-              <w:spacing w:before="0" w:after="0" w:line="240" w:lineRule="auto"/>
+              <w:spacing w:before="0" w:after="0" w:line="252" w:lineRule="auto"/>
               <w:jc w:val="right"/>
             </w:pPr>
             <w:r/>
@@ -2145,7 +2145,7 @@
           </w:tcPr>
           <w:p>
             <w:pPr>
-              <w:spacing w:before="0" w:after="0" w:line="240" w:lineRule="auto"/>
+              <w:spacing w:before="0" w:after="0" w:line="252" w:lineRule="auto"/>
               <w:jc w:val="center"/>
             </w:pPr>
             <w:r/>
@@ -2181,7 +2181,7 @@
           </w:tcPr>
           <w:p>
             <w:pPr>
-              <w:spacing w:before="0" w:after="0" w:line="240" w:lineRule="auto"/>
+              <w:spacing w:before="0" w:after="0" w:line="252" w:lineRule="auto"/>
               <w:jc w:val="left"/>
             </w:pPr>
             <w:r/>
@@ -2217,7 +2217,7 @@
           </w:tcPr>
           <w:p>
             <w:pPr>
-              <w:spacing w:before="0" w:after="0" w:line="240" w:lineRule="auto"/>
+              <w:spacing w:before="0" w:after="0" w:line="252" w:lineRule="auto"/>
               <w:jc w:val="left"/>
             </w:pPr>
             <w:r/>
@@ -2253,7 +2253,7 @@
           </w:tcPr>
           <w:p>
             <w:pPr>
-              <w:spacing w:before="0" w:after="0" w:line="240" w:lineRule="auto"/>
+              <w:spacing w:before="0" w:after="0" w:line="252" w:lineRule="auto"/>
               <w:jc w:val="right"/>
             </w:pPr>
             <w:r/>
@@ -2291,7 +2291,7 @@
           </w:tcPr>
           <w:p>
             <w:pPr>
-              <w:spacing w:before="0" w:after="0" w:line="240" w:lineRule="auto"/>
+              <w:spacing w:before="0" w:after="0" w:line="252" w:lineRule="auto"/>
               <w:jc w:val="center"/>
             </w:pPr>
             <w:r/>
@@ -2327,7 +2327,7 @@
           </w:tcPr>
           <w:p>
             <w:pPr>
-              <w:spacing w:before="0" w:after="0" w:line="240" w:lineRule="auto"/>
+              <w:spacing w:before="0" w:after="0" w:line="252" w:lineRule="auto"/>
               <w:jc w:val="left"/>
             </w:pPr>
             <w:r/>
@@ -2363,7 +2363,7 @@
           </w:tcPr>
           <w:p>
             <w:pPr>
-              <w:spacing w:before="0" w:after="0" w:line="240" w:lineRule="auto"/>
+              <w:spacing w:before="0" w:after="0" w:line="252" w:lineRule="auto"/>
               <w:jc w:val="left"/>
             </w:pPr>
             <w:r/>
@@ -2399,7 +2399,7 @@
           </w:tcPr>
           <w:p>
             <w:pPr>
-              <w:spacing w:before="0" w:after="0" w:line="240" w:lineRule="auto"/>
+              <w:spacing w:before="0" w:after="0" w:line="252" w:lineRule="auto"/>
               <w:jc w:val="right"/>
             </w:pPr>
             <w:r/>
@@ -2437,7 +2437,7 @@
           </w:tcPr>
           <w:p>
             <w:pPr>
-              <w:spacing w:before="0" w:after="0" w:line="240" w:lineRule="auto"/>
+              <w:spacing w:before="0" w:after="0" w:line="252" w:lineRule="auto"/>
               <w:jc w:val="center"/>
             </w:pPr>
             <w:r/>
@@ -2473,7 +2473,7 @@
           </w:tcPr>
           <w:p>
             <w:pPr>
-              <w:spacing w:before="0" w:after="0" w:line="240" w:lineRule="auto"/>
+              <w:spacing w:before="0" w:after="0" w:line="252" w:lineRule="auto"/>
               <w:jc w:val="left"/>
             </w:pPr>
             <w:r/>
@@ -2509,7 +2509,7 @@
           </w:tcPr>
           <w:p>
             <w:pPr>
-              <w:spacing w:before="0" w:after="0" w:line="240" w:lineRule="auto"/>
+              <w:spacing w:before="0" w:after="0" w:line="252" w:lineRule="auto"/>
               <w:jc w:val="left"/>
             </w:pPr>
             <w:r/>
@@ -2545,7 +2545,7 @@
           </w:tcPr>
           <w:p>
             <w:pPr>
-              <w:spacing w:before="0" w:after="0" w:line="240" w:lineRule="auto"/>
+              <w:spacing w:before="0" w:after="0" w:line="252" w:lineRule="auto"/>
               <w:jc w:val="right"/>
             </w:pPr>
             <w:r/>
@@ -2583,7 +2583,7 @@
           </w:tcPr>
           <w:p>
             <w:pPr>
-              <w:spacing w:before="0" w:after="0" w:line="240" w:lineRule="auto"/>
+              <w:spacing w:before="0" w:after="0" w:line="252" w:lineRule="auto"/>
               <w:jc w:val="center"/>
             </w:pPr>
             <w:r/>
@@ -2619,7 +2619,7 @@
           </w:tcPr>
           <w:p>
             <w:pPr>
-              <w:spacing w:before="0" w:after="0" w:line="240" w:lineRule="auto"/>
+              <w:spacing w:before="0" w:after="0" w:line="252" w:lineRule="auto"/>
               <w:jc w:val="left"/>
             </w:pPr>
             <w:r/>
@@ -2655,7 +2655,7 @@
           </w:tcPr>
           <w:p>
             <w:pPr>
-              <w:spacing w:before="0" w:after="0" w:line="240" w:lineRule="auto"/>
+              <w:spacing w:before="0" w:after="0" w:line="252" w:lineRule="auto"/>
               <w:jc w:val="left"/>
             </w:pPr>
             <w:r/>
@@ -2691,7 +2691,7 @@
           </w:tcPr>
           <w:p>
             <w:pPr>
-              <w:spacing w:before="0" w:after="0" w:line="240" w:lineRule="auto"/>
+              <w:spacing w:before="0" w:after="0" w:line="252" w:lineRule="auto"/>
               <w:jc w:val="right"/>
             </w:pPr>
             <w:r/>
@@ -2730,7 +2730,7 @@
           </w:tcPr>
           <w:p>
             <w:pPr>
-              <w:spacing w:before="0" w:after="0" w:line="240" w:lineRule="auto"/>
+              <w:spacing w:before="0" w:after="0" w:line="252" w:lineRule="auto"/>
               <w:jc w:val="center"/>
             </w:pPr>
             <w:r/>
@@ -2767,7 +2767,7 @@
           </w:tcPr>
           <w:p>
             <w:pPr>
-              <w:spacing w:before="0" w:after="0" w:line="240" w:lineRule="auto"/>
+              <w:spacing w:before="0" w:after="0" w:line="252" w:lineRule="auto"/>
               <w:jc w:val="left"/>
             </w:pPr>
             <w:r/>
@@ -2793,7 +2793,7 @@
           </w:tcPr>
           <w:p>
             <w:pPr>
-              <w:spacing w:before="0" w:after="0" w:line="240" w:lineRule="auto"/>
+              <w:spacing w:before="0" w:after="0" w:line="252" w:lineRule="auto"/>
               <w:jc w:val="left"/>
             </w:pPr>
             <w:r/>
@@ -2830,7 +2830,7 @@
           </w:tcPr>
           <w:p>
             <w:pPr>
-              <w:spacing w:before="0" w:after="0" w:line="240" w:lineRule="auto"/>
+              <w:spacing w:before="0" w:after="0" w:line="252" w:lineRule="auto"/>
               <w:jc w:val="right"/>
             </w:pPr>
             <w:r/>
@@ -2859,7 +2859,7 @@
           </w:tcPr>
           <w:p>
             <w:pPr>
-              <w:spacing w:before="0" w:after="0" w:line="240" w:lineRule="auto"/>
+              <w:spacing w:before="0" w:after="0" w:line="252" w:lineRule="auto"/>
               <w:jc w:val="right"/>
             </w:pPr>
             <w:r/>
@@ -2896,7 +2896,7 @@
           </w:tcPr>
           <w:p>
             <w:pPr>
-              <w:spacing w:before="0" w:after="0" w:line="240" w:lineRule="auto"/>
+              <w:spacing w:before="0" w:after="0" w:line="252" w:lineRule="auto"/>
               <w:jc w:val="right"/>
             </w:pPr>
             <w:r/>
@@ -2921,8 +2921,8 @@
             <w:gridSpan w:val="3"/>
             <w:vAlign w:val="center"/>
             <w:tcMar>
-              <w:top w:w="42" w:type="dxa"/>
-              <w:bottom w:w="42" w:type="dxa"/>
+              <w:top w:w="40" w:type="dxa"/>
+              <w:bottom w:w="40" w:type="dxa"/>
               <w:left w:w="90" w:type="dxa"/>
               <w:right w:w="90" w:type="dxa"/>
             </w:tcMar>
@@ -2936,7 +2936,7 @@
           </w:tcPr>
           <w:p>
             <w:pPr>
-              <w:spacing w:before="0" w:after="0" w:line="240" w:lineRule="auto"/>
+              <w:spacing w:before="0" w:after="0" w:line="252" w:lineRule="auto"/>
               <w:jc w:val="right"/>
             </w:pPr>
             <w:r/>
@@ -2958,8 +2958,8 @@
             <w:tcW w:type="dxa" w:w="2160"/>
             <w:vAlign w:val="center"/>
             <w:tcMar>
-              <w:top w:w="42" w:type="dxa"/>
-              <w:bottom w:w="42" w:type="dxa"/>
+              <w:top w:w="40" w:type="dxa"/>
+              <w:bottom w:w="40" w:type="dxa"/>
               <w:left w:w="90" w:type="dxa"/>
               <w:right w:w="90" w:type="dxa"/>
             </w:tcMar>
@@ -2973,7 +2973,7 @@
           </w:tcPr>
           <w:p>
             <w:pPr>
-              <w:spacing w:before="0" w:after="0" w:line="240" w:lineRule="auto"/>
+              <w:spacing w:before="0" w:after="0" w:line="252" w:lineRule="auto"/>
               <w:jc w:val="right"/>
             </w:pPr>
             <w:r/>
@@ -3029,8 +3029,8 @@
             <w:tcW w:type="dxa" w:w="10512"/>
             <w:vAlign w:val="center"/>
             <w:tcMar>
-              <w:top w:w="38" w:type="dxa"/>
-              <w:bottom w:w="35" w:type="dxa"/>
+              <w:top w:w="36" w:type="dxa"/>
+              <w:bottom w:w="34" w:type="dxa"/>
               <w:left w:w="90" w:type="dxa"/>
               <w:right w:w="90" w:type="dxa"/>
             </w:tcMar>
@@ -3044,7 +3044,7 @@
           </w:tcPr>
           <w:p>
             <w:pPr>
-              <w:spacing w:before="0" w:after="0" w:line="240" w:lineRule="auto"/>
+              <w:spacing w:before="0" w:after="0" w:line="252" w:lineRule="auto"/>
               <w:jc w:val="center"/>
             </w:pPr>
             <w:r/>
@@ -3098,8 +3098,8 @@
             <w:tcW w:type="dxa" w:w="792"/>
             <w:vAlign w:val="center"/>
             <w:tcMar>
-              <w:top w:w="40" w:type="dxa"/>
-              <w:bottom w:w="40" w:type="dxa"/>
+              <w:top w:w="38" w:type="dxa"/>
+              <w:bottom w:w="38" w:type="dxa"/>
               <w:left w:w="90" w:type="dxa"/>
               <w:right w:w="90" w:type="dxa"/>
             </w:tcMar>
@@ -3113,7 +3113,7 @@
           </w:tcPr>
           <w:p>
             <w:pPr>
-              <w:spacing w:before="0" w:after="0" w:line="240" w:lineRule="auto"/>
+              <w:spacing w:before="0" w:after="0" w:line="252" w:lineRule="auto"/>
               <w:jc w:val="center"/>
             </w:pPr>
             <w:r/>
@@ -3135,8 +3135,8 @@
             <w:tcW w:type="dxa" w:w="3600"/>
             <w:vAlign w:val="center"/>
             <w:tcMar>
-              <w:top w:w="40" w:type="dxa"/>
-              <w:bottom w:w="40" w:type="dxa"/>
+              <w:top w:w="38" w:type="dxa"/>
+              <w:bottom w:w="38" w:type="dxa"/>
               <w:left w:w="90" w:type="dxa"/>
               <w:right w:w="90" w:type="dxa"/>
             </w:tcMar>
@@ -3150,7 +3150,7 @@
           </w:tcPr>
           <w:p>
             <w:pPr>
-              <w:spacing w:before="0" w:after="0" w:line="240" w:lineRule="auto"/>
+              <w:spacing w:before="0" w:after="0" w:line="252" w:lineRule="auto"/>
               <w:jc w:val="left"/>
             </w:pPr>
             <w:r/>
@@ -3172,8 +3172,8 @@
             <w:tcW w:type="dxa" w:w="3960"/>
             <w:vAlign w:val="center"/>
             <w:tcMar>
-              <w:top w:w="40" w:type="dxa"/>
-              <w:bottom w:w="40" w:type="dxa"/>
+              <w:top w:w="38" w:type="dxa"/>
+              <w:bottom w:w="38" w:type="dxa"/>
               <w:left w:w="90" w:type="dxa"/>
               <w:right w:w="90" w:type="dxa"/>
             </w:tcMar>
@@ -3187,7 +3187,7 @@
           </w:tcPr>
           <w:p>
             <w:pPr>
-              <w:spacing w:before="0" w:after="0" w:line="240" w:lineRule="auto"/>
+              <w:spacing w:before="0" w:after="0" w:line="252" w:lineRule="auto"/>
               <w:jc w:val="left"/>
             </w:pPr>
             <w:r/>
@@ -3209,8 +3209,8 @@
             <w:tcW w:type="dxa" w:w="2160"/>
             <w:vAlign w:val="center"/>
             <w:tcMar>
-              <w:top w:w="40" w:type="dxa"/>
-              <w:bottom w:w="40" w:type="dxa"/>
+              <w:top w:w="38" w:type="dxa"/>
+              <w:bottom w:w="38" w:type="dxa"/>
               <w:left w:w="90" w:type="dxa"/>
               <w:right w:w="90" w:type="dxa"/>
             </w:tcMar>
@@ -3224,7 +3224,7 @@
           </w:tcPr>
           <w:p>
             <w:pPr>
-              <w:spacing w:before="0" w:after="0" w:line="240" w:lineRule="auto"/>
+              <w:spacing w:before="0" w:after="0" w:line="252" w:lineRule="auto"/>
               <w:jc w:val="right"/>
             </w:pPr>
             <w:r/>
@@ -3264,7 +3264,7 @@
           </w:tcPr>
           <w:p>
             <w:pPr>
-              <w:spacing w:before="0" w:after="0" w:line="240" w:lineRule="auto"/>
+              <w:spacing w:before="0" w:after="0" w:line="252" w:lineRule="auto"/>
               <w:jc w:val="left"/>
             </w:pPr>
             <w:r/>
@@ -3302,7 +3302,7 @@
           </w:tcPr>
           <w:p>
             <w:pPr>
-              <w:spacing w:before="0" w:after="0" w:line="240" w:lineRule="auto"/>
+              <w:spacing w:before="0" w:after="0" w:line="252" w:lineRule="auto"/>
               <w:jc w:val="center"/>
             </w:pPr>
             <w:r/>
@@ -3338,7 +3338,7 @@
           </w:tcPr>
           <w:p>
             <w:pPr>
-              <w:spacing w:before="0" w:after="0" w:line="240" w:lineRule="auto"/>
+              <w:spacing w:before="0" w:after="0" w:line="252" w:lineRule="auto"/>
               <w:jc w:val="left"/>
             </w:pPr>
             <w:r/>
@@ -3374,7 +3374,7 @@
           </w:tcPr>
           <w:p>
             <w:pPr>
-              <w:spacing w:before="0" w:after="0" w:line="240" w:lineRule="auto"/>
+              <w:spacing w:before="0" w:after="0" w:line="252" w:lineRule="auto"/>
               <w:jc w:val="left"/>
             </w:pPr>
             <w:r/>
@@ -3410,7 +3410,7 @@
           </w:tcPr>
           <w:p>
             <w:pPr>
-              <w:spacing w:before="0" w:after="0" w:line="240" w:lineRule="auto"/>
+              <w:spacing w:before="0" w:after="0" w:line="252" w:lineRule="auto"/>
               <w:jc w:val="right"/>
             </w:pPr>
             <w:r/>
@@ -3448,7 +3448,7 @@
           </w:tcPr>
           <w:p>
             <w:pPr>
-              <w:spacing w:before="0" w:after="0" w:line="240" w:lineRule="auto"/>
+              <w:spacing w:before="0" w:after="0" w:line="252" w:lineRule="auto"/>
               <w:jc w:val="center"/>
             </w:pPr>
             <w:r/>
@@ -3484,7 +3484,7 @@
           </w:tcPr>
           <w:p>
             <w:pPr>
-              <w:spacing w:before="0" w:after="0" w:line="240" w:lineRule="auto"/>
+              <w:spacing w:before="0" w:after="0" w:line="252" w:lineRule="auto"/>
               <w:jc w:val="left"/>
             </w:pPr>
             <w:r/>
@@ -3520,7 +3520,7 @@
           </w:tcPr>
           <w:p>
             <w:pPr>
-              <w:spacing w:before="0" w:after="0" w:line="240" w:lineRule="auto"/>
+              <w:spacing w:before="0" w:after="0" w:line="252" w:lineRule="auto"/>
               <w:jc w:val="left"/>
             </w:pPr>
             <w:r/>
@@ -3556,7 +3556,7 @@
           </w:tcPr>
           <w:p>
             <w:pPr>
-              <w:spacing w:before="0" w:after="0" w:line="240" w:lineRule="auto"/>
+              <w:spacing w:before="0" w:after="0" w:line="252" w:lineRule="auto"/>
               <w:jc w:val="right"/>
             </w:pPr>
             <w:r/>
@@ -3594,7 +3594,7 @@
           </w:tcPr>
           <w:p>
             <w:pPr>
-              <w:spacing w:before="0" w:after="0" w:line="240" w:lineRule="auto"/>
+              <w:spacing w:before="0" w:after="0" w:line="252" w:lineRule="auto"/>
               <w:jc w:val="center"/>
             </w:pPr>
             <w:r/>
@@ -3630,7 +3630,7 @@
           </w:tcPr>
           <w:p>
             <w:pPr>
-              <w:spacing w:before="0" w:after="0" w:line="240" w:lineRule="auto"/>
+              <w:spacing w:before="0" w:after="0" w:line="252" w:lineRule="auto"/>
               <w:jc w:val="left"/>
             </w:pPr>
             <w:r/>
@@ -3666,7 +3666,7 @@
           </w:tcPr>
           <w:p>
             <w:pPr>
-              <w:spacing w:before="0" w:after="0" w:line="240" w:lineRule="auto"/>
+              <w:spacing w:before="0" w:after="0" w:line="252" w:lineRule="auto"/>
               <w:jc w:val="left"/>
             </w:pPr>
             <w:r/>
@@ -3702,7 +3702,7 @@
           </w:tcPr>
           <w:p>
             <w:pPr>
-              <w:spacing w:before="0" w:after="0" w:line="240" w:lineRule="auto"/>
+              <w:spacing w:before="0" w:after="0" w:line="252" w:lineRule="auto"/>
               <w:jc w:val="right"/>
             </w:pPr>
             <w:r/>
@@ -3740,7 +3740,7 @@
           </w:tcPr>
           <w:p>
             <w:pPr>
-              <w:spacing w:before="0" w:after="0" w:line="240" w:lineRule="auto"/>
+              <w:spacing w:before="0" w:after="0" w:line="252" w:lineRule="auto"/>
               <w:jc w:val="center"/>
             </w:pPr>
             <w:r/>
@@ -3776,7 +3776,7 @@
           </w:tcPr>
           <w:p>
             <w:pPr>
-              <w:spacing w:before="0" w:after="0" w:line="240" w:lineRule="auto"/>
+              <w:spacing w:before="0" w:after="0" w:line="252" w:lineRule="auto"/>
               <w:jc w:val="left"/>
             </w:pPr>
             <w:r/>
@@ -3812,7 +3812,7 @@
           </w:tcPr>
           <w:p>
             <w:pPr>
-              <w:spacing w:before="0" w:after="0" w:line="240" w:lineRule="auto"/>
+              <w:spacing w:before="0" w:after="0" w:line="252" w:lineRule="auto"/>
               <w:jc w:val="left"/>
             </w:pPr>
             <w:r/>
@@ -3848,7 +3848,7 @@
           </w:tcPr>
           <w:p>
             <w:pPr>
-              <w:spacing w:before="0" w:after="0" w:line="240" w:lineRule="auto"/>
+              <w:spacing w:before="0" w:after="0" w:line="252" w:lineRule="auto"/>
               <w:jc w:val="right"/>
             </w:pPr>
             <w:r/>
@@ -3886,7 +3886,7 @@
           </w:tcPr>
           <w:p>
             <w:pPr>
-              <w:spacing w:before="0" w:after="0" w:line="240" w:lineRule="auto"/>
+              <w:spacing w:before="0" w:after="0" w:line="252" w:lineRule="auto"/>
               <w:jc w:val="center"/>
             </w:pPr>
             <w:r/>
@@ -3922,7 +3922,7 @@
           </w:tcPr>
           <w:p>
             <w:pPr>
-              <w:spacing w:before="0" w:after="0" w:line="240" w:lineRule="auto"/>
+              <w:spacing w:before="0" w:after="0" w:line="252" w:lineRule="auto"/>
               <w:jc w:val="left"/>
             </w:pPr>
             <w:r/>
@@ -3958,7 +3958,7 @@
           </w:tcPr>
           <w:p>
             <w:pPr>
-              <w:spacing w:before="0" w:after="0" w:line="240" w:lineRule="auto"/>
+              <w:spacing w:before="0" w:after="0" w:line="252" w:lineRule="auto"/>
               <w:jc w:val="left"/>
             </w:pPr>
             <w:r/>
@@ -3994,7 +3994,7 @@
           </w:tcPr>
           <w:p>
             <w:pPr>
-              <w:spacing w:before="0" w:after="0" w:line="240" w:lineRule="auto"/>
+              <w:spacing w:before="0" w:after="0" w:line="252" w:lineRule="auto"/>
               <w:jc w:val="right"/>
             </w:pPr>
             <w:r/>
@@ -4032,7 +4032,7 @@
           </w:tcPr>
           <w:p>
             <w:pPr>
-              <w:spacing w:before="0" w:after="0" w:line="240" w:lineRule="auto"/>
+              <w:spacing w:before="0" w:after="0" w:line="252" w:lineRule="auto"/>
               <w:jc w:val="center"/>
             </w:pPr>
             <w:r/>
@@ -4068,7 +4068,7 @@
           </w:tcPr>
           <w:p>
             <w:pPr>
-              <w:spacing w:before="0" w:after="0" w:line="240" w:lineRule="auto"/>
+              <w:spacing w:before="0" w:after="0" w:line="252" w:lineRule="auto"/>
               <w:jc w:val="left"/>
             </w:pPr>
             <w:r/>
@@ -4104,7 +4104,7 @@
           </w:tcPr>
           <w:p>
             <w:pPr>
-              <w:spacing w:before="0" w:after="0" w:line="240" w:lineRule="auto"/>
+              <w:spacing w:before="0" w:after="0" w:line="252" w:lineRule="auto"/>
               <w:jc w:val="left"/>
             </w:pPr>
             <w:r/>
@@ -4140,7 +4140,7 @@
           </w:tcPr>
           <w:p>
             <w:pPr>
-              <w:spacing w:before="0" w:after="0" w:line="240" w:lineRule="auto"/>
+              <w:spacing w:before="0" w:after="0" w:line="252" w:lineRule="auto"/>
               <w:jc w:val="right"/>
             </w:pPr>
             <w:r/>
@@ -4178,7 +4178,7 @@
           </w:tcPr>
           <w:p>
             <w:pPr>
-              <w:spacing w:before="0" w:after="0" w:line="240" w:lineRule="auto"/>
+              <w:spacing w:before="0" w:after="0" w:line="252" w:lineRule="auto"/>
               <w:jc w:val="center"/>
             </w:pPr>
             <w:r/>
@@ -4214,7 +4214,7 @@
           </w:tcPr>
           <w:p>
             <w:pPr>
-              <w:spacing w:before="0" w:after="0" w:line="240" w:lineRule="auto"/>
+              <w:spacing w:before="0" w:after="0" w:line="252" w:lineRule="auto"/>
               <w:jc w:val="left"/>
             </w:pPr>
             <w:r/>
@@ -4250,7 +4250,7 @@
           </w:tcPr>
           <w:p>
             <w:pPr>
-              <w:spacing w:before="0" w:after="0" w:line="240" w:lineRule="auto"/>
+              <w:spacing w:before="0" w:after="0" w:line="252" w:lineRule="auto"/>
               <w:jc w:val="left"/>
             </w:pPr>
             <w:r/>
@@ -4286,7 +4286,7 @@
           </w:tcPr>
           <w:p>
             <w:pPr>
-              <w:spacing w:before="0" w:after="0" w:line="240" w:lineRule="auto"/>
+              <w:spacing w:before="0" w:after="0" w:line="252" w:lineRule="auto"/>
               <w:jc w:val="right"/>
             </w:pPr>
             <w:r/>
@@ -4324,7 +4324,7 @@
           </w:tcPr>
           <w:p>
             <w:pPr>
-              <w:spacing w:before="0" w:after="0" w:line="240" w:lineRule="auto"/>
+              <w:spacing w:before="0" w:after="0" w:line="252" w:lineRule="auto"/>
               <w:jc w:val="center"/>
             </w:pPr>
             <w:r/>
@@ -4360,7 +4360,7 @@
           </w:tcPr>
           <w:p>
             <w:pPr>
-              <w:spacing w:before="0" w:after="0" w:line="240" w:lineRule="auto"/>
+              <w:spacing w:before="0" w:after="0" w:line="252" w:lineRule="auto"/>
               <w:jc w:val="left"/>
             </w:pPr>
             <w:r/>
@@ -4396,7 +4396,7 @@
           </w:tcPr>
           <w:p>
             <w:pPr>
-              <w:spacing w:before="0" w:after="0" w:line="240" w:lineRule="auto"/>
+              <w:spacing w:before="0" w:after="0" w:line="252" w:lineRule="auto"/>
               <w:jc w:val="left"/>
             </w:pPr>
             <w:r/>
@@ -4432,7 +4432,7 @@
           </w:tcPr>
           <w:p>
             <w:pPr>
-              <w:spacing w:before="0" w:after="0" w:line="240" w:lineRule="auto"/>
+              <w:spacing w:before="0" w:after="0" w:line="252" w:lineRule="auto"/>
               <w:jc w:val="right"/>
             </w:pPr>
             <w:r/>
@@ -4470,7 +4470,7 @@
           </w:tcPr>
           <w:p>
             <w:pPr>
-              <w:spacing w:before="0" w:after="0" w:line="240" w:lineRule="auto"/>
+              <w:spacing w:before="0" w:after="0" w:line="252" w:lineRule="auto"/>
               <w:jc w:val="center"/>
             </w:pPr>
             <w:r/>
@@ -4506,7 +4506,7 @@
           </w:tcPr>
           <w:p>
             <w:pPr>
-              <w:spacing w:before="0" w:after="0" w:line="240" w:lineRule="auto"/>
+              <w:spacing w:before="0" w:after="0" w:line="252" w:lineRule="auto"/>
               <w:jc w:val="left"/>
             </w:pPr>
             <w:r/>
@@ -4542,7 +4542,7 @@
           </w:tcPr>
           <w:p>
             <w:pPr>
-              <w:spacing w:before="0" w:after="0" w:line="240" w:lineRule="auto"/>
+              <w:spacing w:before="0" w:after="0" w:line="252" w:lineRule="auto"/>
               <w:jc w:val="left"/>
             </w:pPr>
             <w:r/>
@@ -4578,7 +4578,7 @@
           </w:tcPr>
           <w:p>
             <w:pPr>
-              <w:spacing w:before="0" w:after="0" w:line="240" w:lineRule="auto"/>
+              <w:spacing w:before="0" w:after="0" w:line="252" w:lineRule="auto"/>
               <w:jc w:val="right"/>
             </w:pPr>
             <w:r/>
@@ -4616,7 +4616,7 @@
           </w:tcPr>
           <w:p>
             <w:pPr>
-              <w:spacing w:before="0" w:after="0" w:line="240" w:lineRule="auto"/>
+              <w:spacing w:before="0" w:after="0" w:line="252" w:lineRule="auto"/>
               <w:jc w:val="center"/>
             </w:pPr>
             <w:r/>
@@ -4652,7 +4652,7 @@
           </w:tcPr>
           <w:p>
             <w:pPr>
-              <w:spacing w:before="0" w:after="0" w:line="240" w:lineRule="auto"/>
+              <w:spacing w:before="0" w:after="0" w:line="252" w:lineRule="auto"/>
               <w:jc w:val="left"/>
             </w:pPr>
             <w:r/>
@@ -4688,7 +4688,7 @@
           </w:tcPr>
           <w:p>
             <w:pPr>
-              <w:spacing w:before="0" w:after="0" w:line="240" w:lineRule="auto"/>
+              <w:spacing w:before="0" w:after="0" w:line="252" w:lineRule="auto"/>
               <w:jc w:val="left"/>
             </w:pPr>
             <w:r/>
@@ -4724,7 +4724,7 @@
           </w:tcPr>
           <w:p>
             <w:pPr>
-              <w:spacing w:before="0" w:after="0" w:line="240" w:lineRule="auto"/>
+              <w:spacing w:before="0" w:after="0" w:line="252" w:lineRule="auto"/>
               <w:jc w:val="right"/>
             </w:pPr>
             <w:r/>
@@ -4763,7 +4763,7 @@
           </w:tcPr>
           <w:p>
             <w:pPr>
-              <w:spacing w:before="0" w:after="0" w:line="240" w:lineRule="auto"/>
+              <w:spacing w:before="0" w:after="0" w:line="252" w:lineRule="auto"/>
               <w:jc w:val="center"/>
             </w:pPr>
             <w:r/>
@@ -4800,7 +4800,7 @@
           </w:tcPr>
           <w:p>
             <w:pPr>
-              <w:spacing w:before="0" w:after="0" w:line="240" w:lineRule="auto"/>
+              <w:spacing w:before="0" w:after="0" w:line="252" w:lineRule="auto"/>
               <w:jc w:val="left"/>
             </w:pPr>
             <w:r/>
@@ -4826,7 +4826,7 @@
           </w:tcPr>
           <w:p>
             <w:pPr>
-              <w:spacing w:before="0" w:after="0" w:line="240" w:lineRule="auto"/>
+              <w:spacing w:before="0" w:after="0" w:line="252" w:lineRule="auto"/>
               <w:jc w:val="left"/>
             </w:pPr>
             <w:r/>
@@ -4863,7 +4863,7 @@
           </w:tcPr>
           <w:p>
             <w:pPr>
-              <w:spacing w:before="0" w:after="0" w:line="240" w:lineRule="auto"/>
+              <w:spacing w:before="0" w:after="0" w:line="252" w:lineRule="auto"/>
               <w:jc w:val="right"/>
             </w:pPr>
             <w:r/>
@@ -4892,7 +4892,7 @@
           </w:tcPr>
           <w:p>
             <w:pPr>
-              <w:spacing w:before="0" w:after="0" w:line="240" w:lineRule="auto"/>
+              <w:spacing w:before="0" w:after="0" w:line="252" w:lineRule="auto"/>
               <w:jc w:val="right"/>
             </w:pPr>
             <w:r/>
@@ -4929,7 +4929,7 @@
           </w:tcPr>
           <w:p>
             <w:pPr>
-              <w:spacing w:before="0" w:after="0" w:line="240" w:lineRule="auto"/>
+              <w:spacing w:before="0" w:after="0" w:line="252" w:lineRule="auto"/>
               <w:jc w:val="right"/>
             </w:pPr>
             <w:r/>
@@ -4969,7 +4969,7 @@
           </w:tcPr>
           <w:p>
             <w:pPr>
-              <w:spacing w:before="0" w:after="0" w:line="240" w:lineRule="auto"/>
+              <w:spacing w:before="0" w:after="0" w:line="252" w:lineRule="auto"/>
               <w:jc w:val="left"/>
             </w:pPr>
             <w:r/>
@@ -5007,7 +5007,7 @@
           </w:tcPr>
           <w:p>
             <w:pPr>
-              <w:spacing w:before="0" w:after="0" w:line="240" w:lineRule="auto"/>
+              <w:spacing w:before="0" w:after="0" w:line="252" w:lineRule="auto"/>
               <w:jc w:val="center"/>
             </w:pPr>
             <w:r/>
@@ -5043,7 +5043,7 @@
           </w:tcPr>
           <w:p>
             <w:pPr>
-              <w:spacing w:before="0" w:after="0" w:line="240" w:lineRule="auto"/>
+              <w:spacing w:before="0" w:after="0" w:line="252" w:lineRule="auto"/>
               <w:jc w:val="left"/>
             </w:pPr>
             <w:r/>
@@ -5079,7 +5079,7 @@
           </w:tcPr>
           <w:p>
             <w:pPr>
-              <w:spacing w:before="0" w:after="0" w:line="240" w:lineRule="auto"/>
+              <w:spacing w:before="0" w:after="0" w:line="252" w:lineRule="auto"/>
               <w:jc w:val="left"/>
             </w:pPr>
             <w:r/>
@@ -5115,7 +5115,7 @@
           </w:tcPr>
           <w:p>
             <w:pPr>
-              <w:spacing w:before="0" w:after="0" w:line="240" w:lineRule="auto"/>
+              <w:spacing w:before="0" w:after="0" w:line="252" w:lineRule="auto"/>
               <w:jc w:val="right"/>
             </w:pPr>
             <w:r/>
@@ -5153,7 +5153,7 @@
           </w:tcPr>
           <w:p>
             <w:pPr>
-              <w:spacing w:before="0" w:after="0" w:line="240" w:lineRule="auto"/>
+              <w:spacing w:before="0" w:after="0" w:line="252" w:lineRule="auto"/>
               <w:jc w:val="center"/>
             </w:pPr>
             <w:r/>
@@ -5189,7 +5189,7 @@
           </w:tcPr>
           <w:p>
             <w:pPr>
-              <w:spacing w:before="0" w:after="0" w:line="240" w:lineRule="auto"/>
+              <w:spacing w:before="0" w:after="0" w:line="252" w:lineRule="auto"/>
               <w:jc w:val="left"/>
             </w:pPr>
             <w:r/>
@@ -5225,7 +5225,7 @@
           </w:tcPr>
           <w:p>
             <w:pPr>
-              <w:spacing w:before="0" w:after="0" w:line="240" w:lineRule="auto"/>
+              <w:spacing w:before="0" w:after="0" w:line="252" w:lineRule="auto"/>
               <w:jc w:val="left"/>
             </w:pPr>
             <w:r/>
@@ -5261,7 +5261,7 @@
           </w:tcPr>
           <w:p>
             <w:pPr>
-              <w:spacing w:before="0" w:after="0" w:line="240" w:lineRule="auto"/>
+              <w:spacing w:before="0" w:after="0" w:line="252" w:lineRule="auto"/>
               <w:jc w:val="right"/>
             </w:pPr>
             <w:r/>
@@ -5299,7 +5299,7 @@
           </w:tcPr>
           <w:p>
             <w:pPr>
-              <w:spacing w:before="0" w:after="0" w:line="240" w:lineRule="auto"/>
+              <w:spacing w:before="0" w:after="0" w:line="252" w:lineRule="auto"/>
               <w:jc w:val="center"/>
             </w:pPr>
             <w:r/>
@@ -5335,7 +5335,7 @@
           </w:tcPr>
           <w:p>
             <w:pPr>
-              <w:spacing w:before="0" w:after="0" w:line="240" w:lineRule="auto"/>
+              <w:spacing w:before="0" w:after="0" w:line="252" w:lineRule="auto"/>
               <w:jc w:val="left"/>
             </w:pPr>
             <w:r/>
@@ -5371,7 +5371,7 @@
           </w:tcPr>
           <w:p>
             <w:pPr>
-              <w:spacing w:before="0" w:after="0" w:line="240" w:lineRule="auto"/>
+              <w:spacing w:before="0" w:after="0" w:line="252" w:lineRule="auto"/>
               <w:jc w:val="left"/>
             </w:pPr>
             <w:r/>
@@ -5407,7 +5407,7 @@
           </w:tcPr>
           <w:p>
             <w:pPr>
-              <w:spacing w:before="0" w:after="0" w:line="240" w:lineRule="auto"/>
+              <w:spacing w:before="0" w:after="0" w:line="252" w:lineRule="auto"/>
               <w:jc w:val="right"/>
             </w:pPr>
             <w:r/>
@@ -5445,7 +5445,7 @@
           </w:tcPr>
           <w:p>
             <w:pPr>
-              <w:spacing w:before="0" w:after="0" w:line="240" w:lineRule="auto"/>
+              <w:spacing w:before="0" w:after="0" w:line="252" w:lineRule="auto"/>
               <w:jc w:val="center"/>
             </w:pPr>
             <w:r/>
@@ -5481,7 +5481,7 @@
           </w:tcPr>
           <w:p>
             <w:pPr>
-              <w:spacing w:before="0" w:after="0" w:line="240" w:lineRule="auto"/>
+              <w:spacing w:before="0" w:after="0" w:line="252" w:lineRule="auto"/>
               <w:jc w:val="left"/>
             </w:pPr>
             <w:r/>
@@ -5517,7 +5517,7 @@
           </w:tcPr>
           <w:p>
             <w:pPr>
-              <w:spacing w:before="0" w:after="0" w:line="240" w:lineRule="auto"/>
+              <w:spacing w:before="0" w:after="0" w:line="252" w:lineRule="auto"/>
               <w:jc w:val="left"/>
             </w:pPr>
             <w:r/>
@@ -5553,7 +5553,7 @@
           </w:tcPr>
           <w:p>
             <w:pPr>
-              <w:spacing w:before="0" w:after="0" w:line="240" w:lineRule="auto"/>
+              <w:spacing w:before="0" w:after="0" w:line="252" w:lineRule="auto"/>
               <w:jc w:val="right"/>
             </w:pPr>
             <w:r/>
@@ -5592,7 +5592,7 @@
           </w:tcPr>
           <w:p>
             <w:pPr>
-              <w:spacing w:before="0" w:after="0" w:line="240" w:lineRule="auto"/>
+              <w:spacing w:before="0" w:after="0" w:line="252" w:lineRule="auto"/>
               <w:jc w:val="center"/>
             </w:pPr>
             <w:r/>
@@ -5629,7 +5629,7 @@
           </w:tcPr>
           <w:p>
             <w:pPr>
-              <w:spacing w:before="0" w:after="0" w:line="240" w:lineRule="auto"/>
+              <w:spacing w:before="0" w:after="0" w:line="252" w:lineRule="auto"/>
               <w:jc w:val="left"/>
             </w:pPr>
             <w:r/>
@@ -5655,7 +5655,7 @@
           </w:tcPr>
           <w:p>
             <w:pPr>
-              <w:spacing w:before="0" w:after="0" w:line="240" w:lineRule="auto"/>
+              <w:spacing w:before="0" w:after="0" w:line="252" w:lineRule="auto"/>
               <w:jc w:val="left"/>
             </w:pPr>
             <w:r/>
@@ -5692,7 +5692,7 @@
           </w:tcPr>
           <w:p>
             <w:pPr>
-              <w:spacing w:before="0" w:after="0" w:line="240" w:lineRule="auto"/>
+              <w:spacing w:before="0" w:after="0" w:line="252" w:lineRule="auto"/>
               <w:jc w:val="right"/>
             </w:pPr>
             <w:r/>
@@ -5721,7 +5721,7 @@
           </w:tcPr>
           <w:p>
             <w:pPr>
-              <w:spacing w:before="0" w:after="0" w:line="240" w:lineRule="auto"/>
+              <w:spacing w:before="0" w:after="0" w:line="252" w:lineRule="auto"/>
               <w:jc w:val="right"/>
             </w:pPr>
             <w:r/>
@@ -5758,7 +5758,7 @@
           </w:tcPr>
           <w:p>
             <w:pPr>
-              <w:spacing w:before="0" w:after="0" w:line="240" w:lineRule="auto"/>
+              <w:spacing w:before="0" w:after="0" w:line="252" w:lineRule="auto"/>
               <w:jc w:val="right"/>
             </w:pPr>
             <w:r/>
@@ -5798,7 +5798,7 @@
           </w:tcPr>
           <w:p>
             <w:pPr>
-              <w:spacing w:before="0" w:after="0" w:line="240" w:lineRule="auto"/>
+              <w:spacing w:before="0" w:after="0" w:line="252" w:lineRule="auto"/>
               <w:jc w:val="left"/>
             </w:pPr>
             <w:r/>
@@ -5836,7 +5836,7 @@
           </w:tcPr>
           <w:p>
             <w:pPr>
-              <w:spacing w:before="0" w:after="0" w:line="240" w:lineRule="auto"/>
+              <w:spacing w:before="0" w:after="0" w:line="252" w:lineRule="auto"/>
               <w:jc w:val="center"/>
             </w:pPr>
             <w:r/>
@@ -5872,7 +5872,7 @@
           </w:tcPr>
           <w:p>
             <w:pPr>
-              <w:spacing w:before="0" w:after="0" w:line="240" w:lineRule="auto"/>
+              <w:spacing w:before="0" w:after="0" w:line="252" w:lineRule="auto"/>
               <w:jc w:val="left"/>
             </w:pPr>
             <w:r/>
@@ -5908,7 +5908,7 @@
           </w:tcPr>
           <w:p>
             <w:pPr>
-              <w:spacing w:before="0" w:after="0" w:line="240" w:lineRule="auto"/>
+              <w:spacing w:before="0" w:after="0" w:line="252" w:lineRule="auto"/>
               <w:jc w:val="left"/>
             </w:pPr>
             <w:r/>
@@ -5944,7 +5944,7 @@
           </w:tcPr>
           <w:p>
             <w:pPr>
-              <w:spacing w:before="0" w:after="0" w:line="240" w:lineRule="auto"/>
+              <w:spacing w:before="0" w:after="0" w:line="252" w:lineRule="auto"/>
               <w:jc w:val="right"/>
             </w:pPr>
             <w:r/>
@@ -5982,7 +5982,7 @@
           </w:tcPr>
           <w:p>
             <w:pPr>
-              <w:spacing w:before="0" w:after="0" w:line="240" w:lineRule="auto"/>
+              <w:spacing w:before="0" w:after="0" w:line="252" w:lineRule="auto"/>
               <w:jc w:val="center"/>
             </w:pPr>
             <w:r/>
@@ -6018,7 +6018,7 @@
           </w:tcPr>
           <w:p>
             <w:pPr>
-              <w:spacing w:before="0" w:after="0" w:line="240" w:lineRule="auto"/>
+              <w:spacing w:before="0" w:after="0" w:line="252" w:lineRule="auto"/>
               <w:jc w:val="left"/>
             </w:pPr>
             <w:r/>
@@ -6054,7 +6054,7 @@
           </w:tcPr>
           <w:p>
             <w:pPr>
-              <w:spacing w:before="0" w:after="0" w:line="240" w:lineRule="auto"/>
+              <w:spacing w:before="0" w:after="0" w:line="252" w:lineRule="auto"/>
               <w:jc w:val="left"/>
             </w:pPr>
             <w:r/>
@@ -6090,7 +6090,7 @@
           </w:tcPr>
           <w:p>
             <w:pPr>
-              <w:spacing w:before="0" w:after="0" w:line="240" w:lineRule="auto"/>
+              <w:spacing w:before="0" w:after="0" w:line="252" w:lineRule="auto"/>
               <w:jc w:val="right"/>
             </w:pPr>
             <w:r/>
@@ -6128,7 +6128,7 @@
           </w:tcPr>
           <w:p>
             <w:pPr>
-              <w:spacing w:before="0" w:after="0" w:line="240" w:lineRule="auto"/>
+              <w:spacing w:before="0" w:after="0" w:line="252" w:lineRule="auto"/>
               <w:jc w:val="center"/>
             </w:pPr>
             <w:r/>
@@ -6164,7 +6164,7 @@
           </w:tcPr>
           <w:p>
             <w:pPr>
-              <w:spacing w:before="0" w:after="0" w:line="240" w:lineRule="auto"/>
+              <w:spacing w:before="0" w:after="0" w:line="252" w:lineRule="auto"/>
               <w:jc w:val="left"/>
             </w:pPr>
             <w:r/>
@@ -6200,7 +6200,7 @@
           </w:tcPr>
           <w:p>
             <w:pPr>
-              <w:spacing w:before="0" w:after="0" w:line="240" w:lineRule="auto"/>
+              <w:spacing w:before="0" w:after="0" w:line="252" w:lineRule="auto"/>
               <w:jc w:val="left"/>
             </w:pPr>
             <w:r/>
@@ -6236,7 +6236,7 @@
           </w:tcPr>
           <w:p>
             <w:pPr>
-              <w:spacing w:before="0" w:after="0" w:line="240" w:lineRule="auto"/>
+              <w:spacing w:before="0" w:after="0" w:line="252" w:lineRule="auto"/>
               <w:jc w:val="right"/>
             </w:pPr>
             <w:r/>
@@ -6274,7 +6274,7 @@
           </w:tcPr>
           <w:p>
             <w:pPr>
-              <w:spacing w:before="0" w:after="0" w:line="240" w:lineRule="auto"/>
+              <w:spacing w:before="0" w:after="0" w:line="252" w:lineRule="auto"/>
               <w:jc w:val="center"/>
             </w:pPr>
             <w:r/>
@@ -6310,7 +6310,7 @@
           </w:tcPr>
           <w:p>
             <w:pPr>
-              <w:spacing w:before="0" w:after="0" w:line="240" w:lineRule="auto"/>
+              <w:spacing w:before="0" w:after="0" w:line="252" w:lineRule="auto"/>
               <w:jc w:val="left"/>
             </w:pPr>
             <w:r/>
@@ -6346,7 +6346,7 @@
           </w:tcPr>
           <w:p>
             <w:pPr>
-              <w:spacing w:before="0" w:after="0" w:line="240" w:lineRule="auto"/>
+              <w:spacing w:before="0" w:after="0" w:line="252" w:lineRule="auto"/>
               <w:jc w:val="left"/>
             </w:pPr>
             <w:r/>
@@ -6382,7 +6382,7 @@
           </w:tcPr>
           <w:p>
             <w:pPr>
-              <w:spacing w:before="0" w:after="0" w:line="240" w:lineRule="auto"/>
+              <w:spacing w:before="0" w:after="0" w:line="252" w:lineRule="auto"/>
               <w:jc w:val="right"/>
             </w:pPr>
             <w:r/>
@@ -6421,7 +6421,7 @@
           </w:tcPr>
           <w:p>
             <w:pPr>
-              <w:spacing w:before="0" w:after="0" w:line="240" w:lineRule="auto"/>
+              <w:spacing w:before="0" w:after="0" w:line="252" w:lineRule="auto"/>
               <w:jc w:val="center"/>
             </w:pPr>
             <w:r/>
@@ -6458,7 +6458,7 @@
           </w:tcPr>
           <w:p>
             <w:pPr>
-              <w:spacing w:before="0" w:after="0" w:line="240" w:lineRule="auto"/>
+              <w:spacing w:before="0" w:after="0" w:line="252" w:lineRule="auto"/>
               <w:jc w:val="left"/>
             </w:pPr>
             <w:r/>
@@ -6484,7 +6484,7 @@
           </w:tcPr>
           <w:p>
             <w:pPr>
-              <w:spacing w:before="0" w:after="0" w:line="240" w:lineRule="auto"/>
+              <w:spacing w:before="0" w:after="0" w:line="252" w:lineRule="auto"/>
               <w:jc w:val="left"/>
             </w:pPr>
             <w:r/>
@@ -6521,7 +6521,7 @@
           </w:tcPr>
           <w:p>
             <w:pPr>
-              <w:spacing w:before="0" w:after="0" w:line="240" w:lineRule="auto"/>
+              <w:spacing w:before="0" w:after="0" w:line="252" w:lineRule="auto"/>
               <w:jc w:val="right"/>
             </w:pPr>
             <w:r/>
@@ -6550,7 +6550,7 @@
           </w:tcPr>
           <w:p>
             <w:pPr>
-              <w:spacing w:before="0" w:after="0" w:line="240" w:lineRule="auto"/>
+              <w:spacing w:before="0" w:after="0" w:line="252" w:lineRule="auto"/>
               <w:jc w:val="right"/>
             </w:pPr>
             <w:r/>
@@ -6587,7 +6587,7 @@
           </w:tcPr>
           <w:p>
             <w:pPr>
-              <w:spacing w:before="0" w:after="0" w:line="240" w:lineRule="auto"/>
+              <w:spacing w:before="0" w:after="0" w:line="252" w:lineRule="auto"/>
               <w:jc w:val="right"/>
             </w:pPr>
             <w:r/>
@@ -6612,8 +6612,8 @@
             <w:gridSpan w:val="3"/>
             <w:vAlign w:val="center"/>
             <w:tcMar>
-              <w:top w:w="35" w:type="dxa"/>
-              <w:bottom w:w="35" w:type="dxa"/>
+              <w:top w:w="32" w:type="dxa"/>
+              <w:bottom w:w="32" w:type="dxa"/>
               <w:left w:w="90" w:type="dxa"/>
               <w:right w:w="90" w:type="dxa"/>
             </w:tcMar>
@@ -6627,7 +6627,7 @@
           </w:tcPr>
           <w:p>
             <w:pPr>
-              <w:spacing w:before="0" w:after="0" w:line="240" w:lineRule="auto"/>
+              <w:spacing w:before="0" w:after="0" w:line="252" w:lineRule="auto"/>
               <w:jc w:val="right"/>
             </w:pPr>
             <w:r/>
@@ -6649,8 +6649,8 @@
             <w:tcW w:type="dxa" w:w="2160"/>
             <w:vAlign w:val="center"/>
             <w:tcMar>
-              <w:top w:w="35" w:type="dxa"/>
-              <w:bottom w:w="35" w:type="dxa"/>
+              <w:top w:w="32" w:type="dxa"/>
+              <w:bottom w:w="32" w:type="dxa"/>
               <w:left w:w="90" w:type="dxa"/>
               <w:right w:w="90" w:type="dxa"/>
             </w:tcMar>
@@ -6664,7 +6664,7 @@
           </w:tcPr>
           <w:p>
             <w:pPr>
-              <w:spacing w:before="0" w:after="0" w:line="240" w:lineRule="auto"/>
+              <w:spacing w:before="0" w:after="0" w:line="252" w:lineRule="auto"/>
               <w:jc w:val="right"/>
             </w:pPr>
             <w:r/>
@@ -6689,8 +6689,8 @@
             <w:gridSpan w:val="3"/>
             <w:vAlign w:val="center"/>
             <w:tcMar>
-              <w:top w:w="45" w:type="dxa"/>
-              <w:bottom w:w="45" w:type="dxa"/>
+              <w:top w:w="40" w:type="dxa"/>
+              <w:bottom w:w="40" w:type="dxa"/>
               <w:left w:w="90" w:type="dxa"/>
               <w:right w:w="90" w:type="dxa"/>
             </w:tcMar>
@@ -6698,13 +6698,13 @@
             <w:tcBorders>
               <w:top w:val="single" w:sz="8" w:space="0" w:color="059669"/>
               <w:left w:val="single" w:sz="4" w:space="0" w:color="059669"/>
-              <w:bottom w:val="double" w:sz="12" w:space="0" w:color="059669"/>
+              <w:bottom w:val="single" w:sz="8" w:space="0" w:color="059669"/>
               <w:right w:val="single" w:sz="4" w:space="0" w:color="059669"/>
             </w:tcBorders>
           </w:tcPr>
           <w:p>
             <w:pPr>
-              <w:spacing w:before="0" w:after="0" w:line="240" w:lineRule="auto"/>
+              <w:spacing w:before="0" w:after="0" w:line="252" w:lineRule="auto"/>
               <w:jc w:val="right"/>
             </w:pPr>
             <w:r/>
@@ -6714,7 +6714,7 @@
                 <w:b/>
                 <w:i w:val="0"/>
                 <w:color w:val="065F46"/>
-                <w:sz w:val="20"/>
+                <w:sz w:val="19"/>
                 <w:rFonts w:ascii="Hind Siliguri" w:hAnsi="Hind Siliguri" w:cs="Hind Siliguri"/>
               </w:rPr>
               <w:t>সর্বমোট ব্যয় (GRAND TOTAL: ১ম পাতা ৩,৪৯,৭০০ + ২য় পাতা ১,৩৫,০০০):</w:t>
@@ -6726,8 +6726,8 @@
             <w:tcW w:type="dxa" w:w="2160"/>
             <w:vAlign w:val="center"/>
             <w:tcMar>
-              <w:top w:w="45" w:type="dxa"/>
-              <w:bottom w:w="45" w:type="dxa"/>
+              <w:top w:w="40" w:type="dxa"/>
+              <w:bottom w:w="40" w:type="dxa"/>
               <w:left w:w="90" w:type="dxa"/>
               <w:right w:w="90" w:type="dxa"/>
             </w:tcMar>
@@ -6735,13 +6735,13 @@
             <w:tcBorders>
               <w:top w:val="single" w:sz="8" w:space="0" w:color="059669"/>
               <w:left w:val="single" w:sz="4" w:space="0" w:color="059669"/>
-              <w:bottom w:val="double" w:sz="12" w:space="0" w:color="059669"/>
+              <w:bottom w:val="single" w:sz="8" w:space="0" w:color="059669"/>
               <w:right w:val="single" w:sz="4" w:space="0" w:color="059669"/>
             </w:tcBorders>
           </w:tcPr>
           <w:p>
             <w:pPr>
-              <w:spacing w:before="0" w:after="0" w:line="240" w:lineRule="auto"/>
+              <w:spacing w:before="0" w:after="0" w:line="252" w:lineRule="auto"/>
               <w:jc w:val="right"/>
             </w:pPr>
             <w:r/>
@@ -6759,49 +6759,51 @@
           </w:p>
         </w:tc>
       </w:tr>
+      <w:tr>
+        <w:tc>
+          <w:tcPr>
+            <w:tcW w:type="dxa" w:w="10512"/>
+            <w:gridSpan w:val="4"/>
+            <w:vAlign w:val="center"/>
+            <w:tcMar>
+              <w:top w:w="40" w:type="dxa"/>
+              <w:bottom w:w="40" w:type="dxa"/>
+              <w:left w:w="90" w:type="dxa"/>
+              <w:right w:w="90" w:type="dxa"/>
+            </w:tcMar>
+            <w:shd w:fill="F8FAFC"/>
+            <w:tcBorders>
+              <w:top w:val="single" w:sz="8" w:space="0" w:color="059669"/>
+              <w:left w:val="single" w:sz="4" w:space="0" w:color="059669"/>
+              <w:bottom w:val="single" w:sz="8" w:space="0" w:color="059669"/>
+              <w:right w:val="single" w:sz="4" w:space="0" w:color="059669"/>
+            </w:tcBorders>
+          </w:tcPr>
+          <w:p>
+            <w:pPr>
+              <w:spacing w:before="0" w:after="0" w:line="252" w:lineRule="auto"/>
+              <w:jc w:val="center"/>
+            </w:pPr>
+            <w:r/>
+            <w:r>
+              <w:rPr>
+                <w:rFonts w:ascii="Hind Siliguri" w:hAnsi="Hind Siliguri"/>
+                <w:b/>
+                <w:i w:val="0"/>
+                <w:color w:val="1E3A8A"/>
+                <w:sz w:val="19"/>
+                <w:rFonts w:ascii="Hind Siliguri" w:hAnsi="Hind Siliguri" w:cs="Hind Siliguri"/>
+              </w:rPr>
+              <w:t>কথায়: চার লাখ চুরাশি হাজার সাতশত টাকা মাত্র (Four Lakh Eighty-Four Thousand Seven Hundred Taka Only)</w:t>
+            </w:r>
+          </w:p>
+        </w:tc>
+      </w:tr>
     </w:tbl>
     <w:p>
       <w:pPr>
-        <w:spacing w:before="0" w:after="0" w:line="20" w:lineRule="exact"/>
+        <w:spacing w:before="560" w:after="80" w:line="240" w:lineRule="auto"/>
       </w:pPr>
-      <w:r>
-        <w:rPr>
-          <w:rFonts w:ascii="Hind Siliguri" w:hAnsi="Hind Siliguri"/>
-          <w:b/>
-          <w:i w:val="0"/>
-          <w:color w:val="0F172A"/>
-          <w:sz w:val="18"/>
-          <w:rFonts w:ascii="Hind Siliguri" w:hAnsi="Hind Siliguri" w:cs="Hind Siliguri"/>
-        </w:rPr>
-        <w:t xml:space="preserve">কথায়: </w:t>
-      </w:r>
-      <w:r>
-        <w:rPr>
-          <w:rFonts w:ascii="Hind Siliguri" w:hAnsi="Hind Siliguri"/>
-          <w:b/>
-          <w:i w:val="0"/>
-          <w:color w:val="1E3A8A"/>
-          <w:sz w:val="19"/>
-          <w:rFonts w:ascii="Hind Siliguri" w:hAnsi="Hind Siliguri" w:cs="Hind Siliguri"/>
-        </w:rPr>
-        <w:t xml:space="preserve">চার লাখ চুরাশি হাজার সাতশত টাকা মাত্র </w:t>
-      </w:r>
-      <w:r>
-        <w:rPr>
-          <w:rFonts w:ascii="Hind Siliguri" w:hAnsi="Hind Siliguri"/>
-          <w:b w:val="0"/>
-          <w:i/>
-          <w:color w:val="475569"/>
-          <w:sz w:val="17"/>
-          <w:rFonts w:ascii="Hind Siliguri" w:hAnsi="Hind Siliguri" w:cs="Hind Siliguri"/>
-        </w:rPr>
-        <w:t>(Four Lakh Eighty-Four Thousand Seven Hundred Taka Only)</w:t>
-      </w:r>
-      <w:r>
-        <w:rPr>
-          <w:sz w:val="2"/>
-        </w:rPr>
-      </w:r>
     </w:p>
     <w:tbl>
       <w:tblPr>
@@ -6821,7 +6823,43 @@
             <w:tcW w:type="dxa" w:w="4032"/>
             <w:vAlign w:val="center"/>
             <w:tcMar>
-              <w:top w:w="10" w:type="dxa"/>
+              <w:top w:w="0" w:type="dxa"/>
+              <w:bottom w:w="2" w:type="dxa"/>
+              <w:left w:w="90" w:type="dxa"/>
+              <w:right w:w="90" w:type="dxa"/>
+            </w:tcMar>
+            <w:tcBorders>
+              <w:top w:val="single" w:sz="4" w:space="0" w:color="FFFFFF"/>
+              <w:left w:val="single" w:sz="4" w:space="0" w:color="FFFFFF"/>
+              <w:bottom w:val="single" w:sz="4" w:space="0" w:color="FFFFFF"/>
+              <w:right w:val="single" w:sz="4" w:space="0" w:color="FFFFFF"/>
+            </w:tcBorders>
+          </w:tcPr>
+          <w:p>
+            <w:pPr>
+              <w:spacing w:before="0" w:after="0" w:line="252" w:lineRule="auto"/>
+              <w:jc w:val="center"/>
+            </w:pPr>
+            <w:r/>
+            <w:r>
+              <w:rPr>
+                <w:rFonts w:ascii="Hind Siliguri" w:hAnsi="Hind Siliguri"/>
+                <w:b w:val="0"/>
+                <w:i w:val="0"/>
+                <w:color w:val="475569"/>
+                <w:sz w:val="17"/>
+                <w:rFonts w:ascii="Hind Siliguri" w:hAnsi="Hind Siliguri" w:cs="Hind Siliguri"/>
+              </w:rPr>
+              <w:t>--------------------------------------------------</w:t>
+            </w:r>
+          </w:p>
+        </w:tc>
+        <w:tc>
+          <w:tcPr>
+            <w:tcW w:type="dxa" w:w="2448"/>
+            <w:vAlign w:val="center"/>
+            <w:tcMar>
+              <w:top w:w="0" w:type="dxa"/>
               <w:bottom w:w="0" w:type="dxa"/>
               <w:left w:w="90" w:type="dxa"/>
               <w:right w:w="90" w:type="dxa"/>
@@ -6835,7 +6873,70 @@
           </w:tcPr>
           <w:p>
             <w:pPr>
-              <w:spacing w:before="0" w:after="0" w:line="240" w:lineRule="auto"/>
+              <w:spacing w:before="0" w:after="0" w:line="252" w:lineRule="auto"/>
+              <w:jc w:val="left"/>
+            </w:pPr>
+            <w:r/>
+          </w:p>
+        </w:tc>
+        <w:tc>
+          <w:tcPr>
+            <w:tcW w:type="dxa" w:w="4032"/>
+            <w:vAlign w:val="center"/>
+            <w:tcMar>
+              <w:top w:w="0" w:type="dxa"/>
+              <w:bottom w:w="2" w:type="dxa"/>
+              <w:left w:w="90" w:type="dxa"/>
+              <w:right w:w="90" w:type="dxa"/>
+            </w:tcMar>
+            <w:tcBorders>
+              <w:top w:val="single" w:sz="4" w:space="0" w:color="FFFFFF"/>
+              <w:left w:val="single" w:sz="4" w:space="0" w:color="FFFFFF"/>
+              <w:bottom w:val="single" w:sz="4" w:space="0" w:color="FFFFFF"/>
+              <w:right w:val="single" w:sz="4" w:space="0" w:color="FFFFFF"/>
+            </w:tcBorders>
+          </w:tcPr>
+          <w:p>
+            <w:pPr>
+              <w:spacing w:before="0" w:after="0" w:line="252" w:lineRule="auto"/>
+              <w:jc w:val="center"/>
+            </w:pPr>
+            <w:r/>
+            <w:r>
+              <w:rPr>
+                <w:rFonts w:ascii="Hind Siliguri" w:hAnsi="Hind Siliguri"/>
+                <w:b w:val="0"/>
+                <w:i w:val="0"/>
+                <w:color w:val="475569"/>
+                <w:sz w:val="17"/>
+                <w:rFonts w:ascii="Hind Siliguri" w:hAnsi="Hind Siliguri" w:cs="Hind Siliguri"/>
+              </w:rPr>
+              <w:t>--------------------------------------------------</w:t>
+            </w:r>
+          </w:p>
+        </w:tc>
+      </w:tr>
+      <w:tr>
+        <w:tc>
+          <w:tcPr>
+            <w:tcW w:type="dxa" w:w="4032"/>
+            <w:vAlign w:val="center"/>
+            <w:tcMar>
+              <w:top w:w="2" w:type="dxa"/>
+              <w:bottom w:w="5" w:type="dxa"/>
+              <w:left w:w="90" w:type="dxa"/>
+              <w:right w:w="90" w:type="dxa"/>
+            </w:tcMar>
+            <w:tcBorders>
+              <w:top w:val="single" w:sz="4" w:space="0" w:color="FFFFFF"/>
+              <w:left w:val="single" w:sz="4" w:space="0" w:color="FFFFFF"/>
+              <w:bottom w:val="single" w:sz="4" w:space="0" w:color="FFFFFF"/>
+              <w:right w:val="single" w:sz="4" w:space="0" w:color="FFFFFF"/>
+            </w:tcBorders>
+          </w:tcPr>
+          <w:p>
+            <w:pPr>
+              <w:spacing w:before="0" w:after="0" w:line="252" w:lineRule="auto"/>
               <w:jc w:val="center"/>
             </w:pPr>
             <w:r/>
@@ -6845,11 +6946,9 @@
                 <w:b/>
                 <w:i w:val="0"/>
                 <w:color w:val="0F172A"/>
-                <w:sz w:val="18"/>
+                <w:sz w:val="19"/>
                 <w:rFonts w:ascii="Hind Siliguri" w:hAnsi="Hind Siliguri" w:cs="Hind Siliguri"/>
               </w:rPr>
-              <w:t>..........................................................</w:t>
-              <w:br/>
               <w:t>প্রস্তুতকারীর স্বাক্ষর ও তারিখ</w:t>
             </w:r>
           </w:p>
@@ -6859,7 +6958,7 @@
             <w:tcW w:type="dxa" w:w="2448"/>
             <w:vAlign w:val="center"/>
             <w:tcMar>
-              <w:top w:w="10" w:type="dxa"/>
+              <w:top w:w="0" w:type="dxa"/>
               <w:bottom w:w="0" w:type="dxa"/>
               <w:left w:w="90" w:type="dxa"/>
               <w:right w:w="90" w:type="dxa"/>
@@ -6873,7 +6972,7 @@
           </w:tcPr>
           <w:p>
             <w:pPr>
-              <w:spacing w:before="0" w:after="0" w:line="240" w:lineRule="auto"/>
+              <w:spacing w:before="0" w:after="0" w:line="252" w:lineRule="auto"/>
               <w:jc w:val="left"/>
             </w:pPr>
             <w:r/>
@@ -6884,8 +6983,8 @@
             <w:tcW w:type="dxa" w:w="4032"/>
             <w:vAlign w:val="center"/>
             <w:tcMar>
-              <w:top w:w="10" w:type="dxa"/>
-              <w:bottom w:w="0" w:type="dxa"/>
+              <w:top w:w="2" w:type="dxa"/>
+              <w:bottom w:w="5" w:type="dxa"/>
               <w:left w:w="90" w:type="dxa"/>
               <w:right w:w="90" w:type="dxa"/>
             </w:tcMar>
@@ -6898,7 +6997,7 @@
           </w:tcPr>
           <w:p>
             <w:pPr>
-              <w:spacing w:before="0" w:after="0" w:line="240" w:lineRule="auto"/>
+              <w:spacing w:before="0" w:after="0" w:line="252" w:lineRule="auto"/>
               <w:jc w:val="center"/>
             </w:pPr>
             <w:r/>
@@ -6908,11 +7007,9 @@
                 <w:b/>
                 <w:i w:val="0"/>
                 <w:color w:val="0F172A"/>
-                <w:sz w:val="18"/>
+                <w:sz w:val="19"/>
                 <w:rFonts w:ascii="Hind Siliguri" w:hAnsi="Hind Siliguri" w:cs="Hind Siliguri"/>
               </w:rPr>
-              <w:t>..........................................................</w:t>
-              <w:br/>
               <w:t>স্বত্বাধিকারীর স্বাক্ষর (বস)</w:t>
             </w:r>
           </w:p>

</xml_diff>